<commit_message>
Finalize player detail discipline metrics
</commit_message>
<xml_diff>
--- a/docs/official/07_CueScore_Official_Design_Decision_Log_v1.2_Official_Release.docx
+++ b/docs/official/07_CueScore_Official_Design_Decision_Log_v1.2_Official_Release.docx
@@ -5308,12 +5308,12 @@
     </w:p>
     <w:p>
       <w:r>
-        <w:t>保留事項</w:t>
-      </w:r>
-    </w:p>
-    <w:p>
-      <w:r>
-        <w:t>JPA 9 Ball平均イニングは分母の正式定義が未確定のため、確定までは「—」表示とする。3Cおすすめ持ち点はNBA、JPBF、UMB等の公式または十分に信頼できる標準アベレージ対応表を確認できていないため、推測せず「—」表示とする。</w:t>
+        <w:t>確定事項・保留事項</w:t>
+      </w:r>
+    </w:p>
+    <w:p>
+      <w:r>
+        <w:t>JPA 9 Ball平均イニングは、対象試合における自分の完了イニング総数 ÷ 対象試合数とする。0点で終了した完了イニングも総数に含め、保存済みイベントログから再計算する。3Cおすすめ持ち点はNBA、JPBF、UMB等の公式または十分に信頼できる標準アベレージ対応表を確認できていないため、推測せず「—」表示とする。</w:t>
       </w:r>
     </w:p>
     <w:p>
@@ -5333,7 +5333,7 @@
     </w:p>
     <w:p>
       <w:r>
-        <w:t>有効。保留2項目は根拠確定後に別Decisionで算出定義または対応表を追補する。</w:t>
+        <w:t>有効。JPA 9 Ball平均イニングは2026年8月10日に正式定義を追補。3Cおすすめ持ち点は根拠確定後に別Decisionで対応表を追補する。</w:t>
       </w:r>
     </w:p>
     <w:p>
@@ -5477,7 +5477,7 @@
     </w:p>
     <w:p>
       <w:r>
-        <w:t>2026年8月9日　競技別プレーヤー統計4指標 v1.0を採用。JPA平均イニングと3Cおすすめ持ち点は根拠確定まで未算出とした。</w:t>
+        <w:t>2026年8月9日　競技別プレーヤー統計4指標 v1.0を採用。JPA平均イニングと3Cおすすめ持ち点は根拠確定まで未算出とした。2026年8月10日　JPA 9 Ball平均イニングを、自分の完了イニング総数 ÷ 対象試合数（0点完了イニングを含む）として正式確定。3Cおすすめ持ち点は根拠確定まで未算出を維持。</w:t>
       </w:r>
     </w:p>
     <w:p>

</xml_diff>